<commit_message>
paper: fix table numbering in v8 final (param summary -> Table 2, cascade)
</commit_message>
<xml_diff>
--- a/UAV_v8_final.docx
+++ b/UAV_v8_final.docx
@@ -15362,10 +15362,7 @@
     </w:tbl>
     <w:p>
       <w:r>
-        <w:rPr>
-          <w:i/>
-        </w:rPr>
-        <w:t xml:space="preserve">Table 3. Simulation parameter summary. See §3.1–§3.5 and §4.3 for derivations.</w:t>
+        <w:t xml:space="preserve">Table 2. Simulation parameter summary. See §3.1–§3.5 and §4.3 for derivations.</w:t>
       </w:r>
     </w:p>
     <w:p>
@@ -18889,66 +18886,9 @@
           <w:szCs w:val="18"/>
         </w:rPr>
       </w:pPr>
-      <w:sdt>
-        <w:sdtPr>
-          <w:tag w:val="goog_rdk_359"/>
-          <w:id w:val="2070165270"/>
-        </w:sdtPr>
-        <w:sdtContent>
-          <w:r>
-            <w:rPr>
-              <w:b/>
-              <w:bCs/>
-              <w:sz w:val="18"/>
-              <w:szCs w:val="18"/>
-            </w:rPr>
-            <w:t>Table 3.</w:t>
-          </w:r>
-        </w:sdtContent>
-      </w:sdt>
-      <w:sdt>
-        <w:sdtPr>
-          <w:tag w:val="goog_rdk_360"/>
-          <w:id w:val="-1218711082"/>
-        </w:sdtPr>
-        <w:sdtContent>
-          <w:r>
-            <w:rPr>
-              <w:b/>
-              <w:bCs/>
-              <w:sz w:val="18"/>
-              <w:szCs w:val="18"/>
-            </w:rPr>
-          </w:r>
-          <w:r>
-            <w:rPr>
-              <w:sz w:val="18"/>
-              <w:szCs w:val="18"/>
-            </w:rPr>
-            <w:t xml:space="preserve"> Scenario overview. Three OSM-based scenarios grounded in real Greek wildfires.</w:t>
-          </w:r>
-          <w:r>
-            <w:rPr>
-              <w:rFonts w:eastAsia="Palatino Linotype" w:cs="Palatino Linotype"/>
-              <w:b w:val="false"/>
-              <w:bCs w:val="false"/>
-              <w:i w:val="false"/>
-              <w:iCs w:val="false"/>
-              <w:caps w:val="false"/>
-              <w:smallCaps w:val="false"/>
-              <w:strike w:val="false"/>
-              <w:dstrike w:val="false"/>
-              <w:color w:val="000000"/>
-              <w:position w:val="0"/>
-              <w:sz w:val="20"/>
-              <w:szCs w:val="20"/>
-              <w:u w:val="none"/>
-              <w:vertAlign w:val="baseline"/>
-            </w:rPr>
-            <w:t xml:space="preserve"> In Table 3, Service time is the number of simulation steps during which the UAV must hover over the POI before the mission is registered as completed (0 for a fly-through delivery, 2 for casualty triage, 3 for a perimeter snapshot); Map density is the fraction of the 500×500 grid occupied by buildings, read directly from the OSM tile and used as the structural-clutter proxy; Fire ignitions is the number of initial burning cells seeded at t = 0 (configured in the scenario YAML).</w:t>
-          </w:r>
-        </w:sdtContent>
-      </w:sdt>
+      <w:r>
+        <w:t xml:space="preserve">Table 4. Scenario overview. Three OSM-based scenarios grounded in real Greek wildfires. In Table 4, Service time is the number of simulation steps during which the UAV must hover over the POI before the mission is registered as completed (0 for a fly-through delivery, 2 for casualty triage, 3 for a perimeter snapshot); Map density is the fraction of the 500×500 grid occupied by buildings, read directly from the OSM tile and used as the structural-clutter proxy; Fire ignitions is the number of initial burning cells seeded at t = 0 (configured in the scenario YAML).</w:t>
+      </w:r>
     </w:p>
     <w:tbl>
       <w:tblPr>
@@ -20792,57 +20732,8 @@
           <w:vertAlign w:val="baseline"/>
         </w:rPr>
       </w:pPr>
-      <w:sdt>
-        <w:sdtPr>
-          <w:tag w:val="goog_rdk_396"/>
-          <w:id w:val="-507544675"/>
-        </w:sdtPr>
-        <w:sdtContent>
-          <w:r>
-            <w:rPr/>
-          </w:r>
-        </w:sdtContent>
-      </w:sdt>
-      <w:r>
-        <w:rPr>
-          <w:rFonts w:eastAsia="Palatino Linotype" w:cs="Palatino Linotype"/>
-          <w:b w:val="false"/>
-          <w:bCs w:val="false"/>
-          <w:i w:val="false"/>
-          <w:iCs w:val="false"/>
-          <w:caps w:val="false"/>
-          <w:smallCaps w:val="false"/>
-          <w:strike w:val="false"/>
-          <w:dstrike w:val="false"/>
-          <w:color w:val="000000"/>
-          <w:position w:val="0"/>
-          <w:sz w:val="20"/>
-          <w:szCs w:val="20"/>
-          <w:u w:val="none"/>
-          <w:shd w:fill="auto" w:val="clear"/>
-          <w:vertAlign w:val="baseline"/>
-        </w:rPr>
-        <w:t>Table 4 disaggregates by scenario with mission-specific metrics and verdicts. Two patterns stand out: (i) Piraeus yields the highest success rates (67–70%) because its dense layout provides many alternative routes; (ii) Downtown is hardest, with extreme density constraining detours.</w:t>
-      </w:r>
-      <w:r>
-        <w:rPr>
-          <w:rFonts w:eastAsia="Palatino Linotype" w:cs="Palatino Linotype"/>
-          <w:b w:val="false"/>
-          <w:bCs w:val="false"/>
-          <w:i w:val="false"/>
-          <w:iCs w:val="false"/>
-          <w:caps w:val="false"/>
-          <w:smallCaps w:val="false"/>
-          <w:strike w:val="false"/>
-          <w:dstrike w:val="false"/>
-          <w:color w:val="000000"/>
-          <w:position w:val="0"/>
-          <w:sz w:val="20"/>
-          <w:szCs w:val="20"/>
-          <w:u w:val="none"/>
-          <w:vertAlign w:val="baseline"/>
-        </w:rPr>
-        <w:t xml:space="preserve"> A closer read of Table 4 reveals three scenario-specific signatures. On Penteli (pharmaceutical delivery), Incremental A* reaches the POI in every feasible seed (53% SR) at the cost of long paths that shave efficacy; Aggressive Replan arrives ≈20 steps earlier on average, and its quadratic E(t) payoff more than compensates for the lower completion rate. On Piraeus (urban rescue), the dense port topology offers many alternative corridors, so every adaptive planner clears 67–70% feasible SR, but the exponential Si(t) × fire-coupling amplifies small differences in delivery time into large differences in mission score: Aggressive Replan wins with MS ≈ 2.98 while Incremental A* trails at 1.62 even though both reach the casualty. On Downtown (fire-perimeter surveillance), 0.50 building density plus one mandatory no-fly zone eliminate most detours, so the MS ranking converges with the SR ranking — the linear freshness decay F(t) is forgiving enough that whoever finishes first wins. These per-scenario patterns demonstrate that the ranking-inversion magnitude is not a single-scenario artefact but varies continuously with the score-decay shape and the map density (see the pharma-delivery result of Section 4.5 in particular, where the inversion is sharpest).</w:t>
+      <w:r>
+        <w:t xml:space="preserve">Table 5 disaggregates by scenario with mission-specific metrics and verdicts. Two patterns stand out: (i) Piraeus yields the highest success rates (67–70%) because its dense layout provides many alternative routes; (ii) Downtown is hardest, with extreme density constraining detours. A closer read of Table 4 reveals three scenario-specific signatures. On Penteli (pharmaceutical delivery), Incremental A* reaches the POI in every feasible seed (53% SR) at the cost of long paths that shave efficacy; Aggressive Replan arrives ≈20 steps earlier on average, and its quadratic E(t) payoff more than compensates for the lower completion rate. On Piraeus (urban rescue), the dense port topology offers many alternative corridors, so every adaptive planner clears 67–70% feasible SR, but the exponential Si(t) × fire-coupling amplifies small differences in delivery time into large differences in mission score: Aggressive Replan wins with MS ≈ 2.98 while Incremental A* trails at 1.62 even though both reach the casualty. On Downtown (fire-perimeter surveillance), 0.50 building density plus one mandatory no-fly zone eliminate most detours, so the MS ranking converges with the SR ranking — the linear freshness decay F(t) is forgiving enough that whoever finishes first wins. These per-scenario patterns demonstrate that the ranking-inversion magnitude is not a single-scenario artefact but varies continuously with the score-decay shape and the map density (see the pharma-delivery result of Section 4.5 in particular, where the inversion is sharpest).</w:t>
       </w:r>
     </w:p>
     <w:p>
@@ -20877,137 +20768,7 @@
         </w:rPr>
       </w:pPr>
       <w:r>
-        <w:rPr>
-          <w:rFonts w:eastAsia="Palatino Linotype" w:cs="Palatino Linotype"/>
-          <w:b/>
-          <w:bCs/>
-          <w:i w:val="false"/>
-          <w:iCs w:val="false"/>
-          <w:caps w:val="false"/>
-          <w:smallCaps w:val="false"/>
-          <w:strike w:val="false"/>
-          <w:dstrike w:val="false"/>
-          <w:color w:val="000000"/>
-          <w:position w:val="0"/>
-          <w:sz w:val="18"/>
-          <w:szCs w:val="18"/>
-          <w:u w:val="none"/>
-          <w:shd w:fill="auto" w:val="clear"/>
-          <w:vertAlign w:val="baseline"/>
-        </w:rPr>
-        <w:t>Table 4.</w:t>
-      </w:r>
-      <w:r>
-        <w:rPr>
-          <w:rFonts w:eastAsia="Palatino Linotype" w:cs="Palatino Linotype"/>
-          <w:b w:val="false"/>
-          <w:bCs w:val="false"/>
-          <w:i w:val="false"/>
-          <w:iCs w:val="false"/>
-          <w:caps w:val="false"/>
-          <w:smallCaps w:val="false"/>
-          <w:strike w:val="false"/>
-          <w:dstrike w:val="false"/>
-          <w:color w:val="000000"/>
-          <w:position w:val="0"/>
-          <w:sz w:val="18"/>
-          <w:szCs w:val="18"/>
-          <w:u w:val="none"/>
-          <w:shd w:fill="auto" w:val="clear"/>
-          <w:vertAlign w:val="baseline"/>
-        </w:rPr>
-        <w:t xml:space="preserve"> Mission scorecard. Per-scenario results with mission-specific metrics. ★ marks the best mission score per scenario. </w:t>
-      </w:r>
-      <w:r>
-        <w:rPr>
-          <w:rFonts w:eastAsia="Palatino Linotype" w:cs="Palatino Linotype"/>
-          <w:b/>
-          <w:bCs/>
-          <w:i w:val="false"/>
-          <w:iCs w:val="false"/>
-          <w:caps w:val="false"/>
-          <w:smallCaps w:val="false"/>
-          <w:strike w:val="false"/>
-          <w:dstrike w:val="false"/>
-          <w:color w:val="000000"/>
-          <w:position w:val="0"/>
-          <w:sz w:val="18"/>
-          <w:szCs w:val="18"/>
-          <w:u w:val="none"/>
-          <w:shd w:fill="auto" w:val="clear"/>
-          <w:vertAlign w:val="baseline"/>
-        </w:rPr>
-        <w:t>Bold</w:t>
-      </w:r>
-      <w:r>
-        <w:rPr>
-          <w:rFonts w:eastAsia="Palatino Linotype" w:cs="Palatino Linotype"/>
-          <w:b w:val="false"/>
-          <w:bCs w:val="false"/>
-          <w:i w:val="false"/>
-          <w:iCs w:val="false"/>
-          <w:caps w:val="false"/>
-          <w:smallCaps w:val="false"/>
-          <w:strike w:val="false"/>
-          <w:dstrike w:val="false"/>
-          <w:color w:val="000000"/>
-          <w:position w:val="0"/>
-          <w:sz w:val="18"/>
-          <w:szCs w:val="18"/>
-          <w:u w:val="none"/>
-          <w:shd w:fill="auto" w:val="clear"/>
-          <w:vertAlign w:val="baseline"/>
-        </w:rPr>
-        <w:t xml:space="preserve"> marks the best success rate.</w:t>
-      </w:r>
-      <w:sdt>
-        <w:sdtPr>
-          <w:tag w:val="goog_rdk_397"/>
-          <w:id w:val="692080730"/>
-        </w:sdtPr>
-        <w:sdtContent>
-          <w:r>
-            <w:rPr>
-              <w:rFonts w:eastAsia="Palatino Linotype" w:cs="Palatino Linotype"/>
-              <w:b w:val="false"/>
-              <w:bCs w:val="false"/>
-              <w:i w:val="false"/>
-              <w:iCs w:val="false"/>
-              <w:caps w:val="false"/>
-              <w:smallCaps w:val="false"/>
-              <w:strike w:val="false"/>
-              <w:dstrike w:val="false"/>
-              <w:color w:val="000000"/>
-              <w:position w:val="0"/>
-              <w:sz w:val="18"/>
-              <w:szCs w:val="18"/>
-              <w:u w:val="none"/>
-              <w:shd w:fill="auto" w:val="clear"/>
-              <w:vertAlign w:val="baseline"/>
-            </w:rPr>
-          </w:r>
-        </w:sdtContent>
-      </w:sdt>
-      <w:r>
-        <w:rPr>
-          <w:rFonts w:eastAsia="Palatino Linotype" w:cs="Palatino Linotype"/>
-          <w:b w:val="false"/>
-          <w:bCs w:val="false"/>
-          <w:i w:val="false"/>
-          <w:iCs w:val="false"/>
-          <w:caps w:val="false"/>
-          <w:smallCaps w:val="false"/>
-          <w:strike w:val="false"/>
-          <w:dstrike w:val="false"/>
-          <w:color w:val="000000"/>
-          <w:position w:val="0"/>
-          <w:sz w:val="18"/>
-          <w:szCs w:val="18"/>
-          <w:u w:val="none"/>
-          <w:shd w:fill="auto" w:val="clear"/>
-          <w:vertAlign w:val="baseline"/>
-        </w:rPr>
-        <w:t>.</w:t>
+        <w:t xml:space="preserve">Table 5. Mission scorecard. Per-scenario results with mission-specific metrics. ★ marks the best mission score per scenario. Bold marks the best success rate..</w:t>
       </w:r>
     </w:p>
     <w:tbl>
@@ -27190,46 +26951,7 @@
         </w:rPr>
       </w:pPr>
       <w:r>
-        <w:rPr>
-          <w:rFonts w:eastAsia="Palatino Linotype" w:cs="Palatino Linotype"/>
-          <w:b/>
-          <w:bCs/>
-          <w:i w:val="false"/>
-          <w:iCs w:val="false"/>
-          <w:caps w:val="false"/>
-          <w:smallCaps w:val="false"/>
-          <w:strike w:val="false"/>
-          <w:dstrike w:val="false"/>
-          <w:color w:val="000000"/>
-          <w:position w:val="0"/>
-          <w:sz w:val="18"/>
-          <w:szCs w:val="18"/>
-          <w:u w:val="none"/>
-          <w:shd w:fill="auto" w:val="clear"/>
-          <w:vertAlign w:val="baseline"/>
-        </w:rPr>
-        <w:t>Table 5.</w:t>
-      </w:r>
-      <w:r>
-        <w:rPr>
-          <w:rFonts w:eastAsia="Palatino Linotype" w:cs="Palatino Linotype"/>
-          <w:b w:val="false"/>
-          <w:bCs w:val="false"/>
-          <w:i w:val="false"/>
-          <w:iCs w:val="false"/>
-          <w:caps w:val="false"/>
-          <w:smallCaps w:val="false"/>
-          <w:strike w:val="false"/>
-          <w:dstrike w:val="false"/>
-          <w:color w:val="000000"/>
-          <w:position w:val="0"/>
-          <w:sz w:val="18"/>
-          <w:szCs w:val="18"/>
-          <w:u w:val="none"/>
-          <w:shd w:fill="auto" w:val="clear"/>
-          <w:vertAlign w:val="baseline"/>
-        </w:rPr>
-        <w:t xml:space="preserve"> Statistical validation. Friedman confirms ranking differences; bootstrap CIs quantify uncertainty.</w:t>
+        <w:t xml:space="preserve">Table 6. Statistical validation. Friedman confirms ranking differences; bootstrap CIs quantify uncertainty.</w:t>
       </w:r>
     </w:p>
     <w:tbl>

</xml_diff>

<commit_message>
paper: split §4.4 heading from body paragraph
</commit_message>
<xml_diff>
--- a/UAV_v8_final.docx
+++ b/UAV_v8_final.docx
@@ -20606,13 +20606,12 @@
         </w:rPr>
       </w:pPr>
       <w:r>
-        <w:rPr>
-          <w:b/>
-          <w:bCs/>
-          <w:sz w:val="24"/>
-          <w:szCs w:val="24"/>
-        </w:rPr>
-        <w:t xml:space="preserve">4.4. Navigation PerformanceNavigation performance is measured as feasible success rate (SR) over the 415 feasible episodes, where an episode is marked successful if the UAV reaches the goal POI before the 900-step horizon and is not terminated by a fatal hazard (FIRE_CAUGHT, DEBRIS_CAUGHT, or VEHICLE_COLLISION). For each (planner, scenario) pair we additionally record the mean executed step count, the mean number of replans, and the dominant rejection reason, then aggregate across the 30 seeds. The five adaptive policies are compared under identical frozen fire states and identical blocking masks at every step (contracts FC-2 and FC-3), so any difference in SR is attributable solely to the risk coefficient ρ and the replanning trigger. </w:t>
+        <w:t xml:space="preserve">4.4. Navigation Performance</w:t>
+      </w:r>
+    </w:p>
+    <w:p>
+      <w:r>
+        <w:t xml:space="preserve">Navigation performance is measured as feasible success rate (SR) over the 415 feasible episodes, where an episode is marked successful if the UAV reaches the goal POI before the 900-step horizon and is not terminated by a fatal hazard (FIRE_CAUGHT, DEBRIS_CAUGHT, or VEHICLE_COLLISION). For each (planner, scenario) pair we additionally record the mean executed step count, the mean number of replans, and the dominant rejection reason, then aggregate across the 30 seeds. The five adaptive policies are compared under identical frozen fire states and identical blocking masks at every step (contracts FC-2 and FC-3), so any difference in SR is attributable solely to the risk coefficient ρ and the replanning trigger. </w:t>
       </w:r>
     </w:p>
     <w:p>

</xml_diff>